<commit_message>
03: sin control de tamaño, winsorización, primer eslabón sin el año 2022 (5b) y primeros eslabones alternativos: rentabilidad y salida (5c)
Co-Authored-By: Claude Sonnet 5 <noreply@anthropic.com>
</commit_message>
<xml_diff>
--- a/4. RESULTADOS/03_primer_eslabon_medidas/T01_cobertura_medidas.docx
+++ b/4. RESULTADOS/03_primer_eslabon_medidas/T01_cobertura_medidas.docx
@@ -320,7 +320,7 @@
                 <w:szCs w:val="22"/>
                 <w:color w:val="000000"/>
               </w:rPr>
-              <w:t xml:space="preserve">4,972</w:t>
+              <w:t xml:space="preserve">5,099</w:t>
             </w:r>
           </w:p>
         </w:tc>
@@ -375,7 +375,7 @@
                 <w:szCs w:val="22"/>
                 <w:color w:val="000000"/>
               </w:rPr>
-              <w:t xml:space="preserve">4,863</w:t>
+              <w:t xml:space="preserve">4,979</w:t>
             </w:r>
           </w:p>
         </w:tc>
@@ -660,7 +660,7 @@
                 <w:szCs w:val="22"/>
                 <w:color w:val="000000"/>
               </w:rPr>
-              <w:t xml:space="preserve">5,713</w:t>
+              <w:t xml:space="preserve">5,742</w:t>
             </w:r>
           </w:p>
         </w:tc>
@@ -715,7 +715,7 @@
                 <w:szCs w:val="22"/>
                 <w:color w:val="000000"/>
               </w:rPr>
-              <w:t xml:space="preserve">5,577</w:t>
+              <w:t xml:space="preserve">5,599</w:t>
             </w:r>
           </w:p>
         </w:tc>
@@ -830,7 +830,7 @@
                 <w:szCs w:val="22"/>
                 <w:color w:val="000000"/>
               </w:rPr>
-              <w:t xml:space="preserve">5,706</w:t>
+              <w:t xml:space="preserve">5,742</w:t>
             </w:r>
           </w:p>
         </w:tc>
@@ -885,7 +885,7 @@
                 <w:szCs w:val="22"/>
                 <w:color w:val="000000"/>
               </w:rPr>
-              <w:t xml:space="preserve">5,572</w:t>
+              <w:t xml:space="preserve">5,599</w:t>
             </w:r>
           </w:p>
         </w:tc>
@@ -1000,7 +1000,7 @@
                 <w:szCs w:val="22"/>
                 <w:color w:val="000000"/>
               </w:rPr>
-              <w:t xml:space="preserve">6,083</w:t>
+              <w:t xml:space="preserve">6,178</w:t>
             </w:r>
           </w:p>
         </w:tc>
@@ -1055,7 +1055,7 @@
                 <w:szCs w:val="22"/>
                 <w:color w:val="000000"/>
               </w:rPr>
-              <w:t xml:space="preserve">5,942</w:t>
+              <w:t xml:space="preserve">6,017</w:t>
             </w:r>
           </w:p>
         </w:tc>

</xml_diff>